<commit_message>
Add one field in contract renewal
</commit_message>
<xml_diff>
--- a/ContractRenewal.docx
+++ b/ContractRenewal.docx
@@ -26,6 +26,7 @@
           <w:text/>
         </w:sdtPr>
         <w:sdtContent>
+          <w:proofErr w:type="spellStart"/>
           <w:r>
             <w:rPr>
               <w:b/>
@@ -33,6 +34,7 @@
             </w:rPr>
             <w:t>CurrentDate</w:t>
           </w:r>
+          <w:proofErr w:type="spellEnd"/>
         </w:sdtContent>
       </w:sdt>
       <w:r>
@@ -57,6 +59,7 @@
           <w:text/>
         </w:sdtPr>
         <w:sdtContent>
+          <w:proofErr w:type="spellStart"/>
           <w:r>
             <w:rPr>
               <w:b/>
@@ -64,6 +67,7 @@
             </w:rPr>
             <w:t>Tenant_Full_Name</w:t>
           </w:r>
+          <w:proofErr w:type="spellEnd"/>
         </w:sdtContent>
       </w:sdt>
       <w:r>
@@ -89,6 +93,7 @@
           <w:text/>
         </w:sdtPr>
         <w:sdtContent>
+          <w:proofErr w:type="spellStart"/>
           <w:r>
             <w:rPr>
               <w:b/>
@@ -96,6 +101,7 @@
             </w:rPr>
             <w:t>Unit_Number</w:t>
           </w:r>
+          <w:proofErr w:type="spellEnd"/>
         </w:sdtContent>
       </w:sdt>
       <w:r>
@@ -121,6 +127,7 @@
           <w:text/>
         </w:sdtPr>
         <w:sdtContent>
+          <w:proofErr w:type="spellStart"/>
           <w:r>
             <w:rPr>
               <w:b/>
@@ -128,6 +135,7 @@
             </w:rPr>
             <w:t>Property_Name</w:t>
           </w:r>
+          <w:proofErr w:type="spellEnd"/>
         </w:sdtContent>
       </w:sdt>
       <w:r>
@@ -195,12 +203,14 @@
           <w:text/>
         </w:sdtPr>
         <w:sdtContent>
+          <w:proofErr w:type="spellStart"/>
           <w:r>
             <w:rPr>
               <w:lang w:val="en-IN"/>
             </w:rPr>
             <w:t>Tenant_Full_Name</w:t>
           </w:r>
+          <w:proofErr w:type="spellEnd"/>
         </w:sdtContent>
       </w:sdt>
       <w:r>
@@ -237,6 +247,7 @@
           <w:text/>
         </w:sdtPr>
         <w:sdtContent>
+          <w:proofErr w:type="spellStart"/>
           <w:r>
             <w:rPr>
               <w:b/>
@@ -244,6 +255,7 @@
             </w:rPr>
             <w:t>Unit_Number</w:t>
           </w:r>
+          <w:proofErr w:type="spellEnd"/>
         </w:sdtContent>
       </w:sdt>
       <w:r>
@@ -265,6 +277,7 @@
           <w:text/>
         </w:sdtPr>
         <w:sdtContent>
+          <w:proofErr w:type="spellStart"/>
           <w:r>
             <w:rPr>
               <w:b/>
@@ -272,6 +285,7 @@
             </w:rPr>
             <w:t>Property_Name</w:t>
           </w:r>
+          <w:proofErr w:type="spellEnd"/>
         </w:sdtContent>
       </w:sdt>
       <w:r>
@@ -334,6 +348,7 @@
           <w:text/>
         </w:sdtPr>
         <w:sdtContent>
+          <w:proofErr w:type="spellStart"/>
           <w:r>
             <w:rPr>
               <w:b/>
@@ -342,6 +357,7 @@
             </w:rPr>
             <w:t>Contract_End_Date</w:t>
           </w:r>
+          <w:proofErr w:type="spellEnd"/>
         </w:sdtContent>
       </w:sdt>
       <w:r>
@@ -416,22 +432,22 @@
           <w:rPr>
             <w:lang w:val="en-IN"/>
           </w:rPr>
-          <w:alias w:val="#Nav: /ContractRenewal/Rent_Amount"/>
-          <w:tag w:val="#Nav: Contract_Renewal/50108"/>
-          <w:id w:val="-267310822"/>
+          <w:id w:val="640704773"/>
           <w:placeholder>
             <w:docPart w:val="DefaultPlaceholder_-1854013440"/>
           </w:placeholder>
-          <w:dataBinding w:prefixMappings="xmlns:ns0='urn:microsoft-dynamics-nav/reports/Contract_Renewal/50108/'" w:xpath="/ns0:NavWordReportXmlPart[1]/ns0:ContractRenewal[1]/ns0:Rent_Amount[1]" w:storeItemID="{BD9CF13E-9824-44A6-B64B-7DDEA188B36D}"/>
+          <w:dataBinding w:prefixMappings="xmlns:ns0='urn:microsoft-dynamics-nav/reports/Contract_Renewal/50108/' " w:xpath="/ns0:NavWordReportXmlPart[1]/ns0:ContractRenewal[1]/ns0:Annual_Rent_Amount[1]" w:storeItemID="{BD9CF13E-9824-44A6-B64B-7DDEA188B36D}"/>
           <w:text/>
         </w:sdtPr>
         <w:sdtContent>
+          <w:proofErr w:type="spellStart"/>
           <w:r>
             <w:rPr>
               <w:lang w:val="en-IN"/>
             </w:rPr>
-            <w:t>Rent_Amount</w:t>
+            <w:t>Annual_Rent_Amount</w:t>
           </w:r>
+          <w:proofErr w:type="spellEnd"/>
         </w:sdtContent>
       </w:sdt>
       <w:r>
@@ -489,12 +505,21 @@
         </w:rPr>
         <w:br/>
       </w:r>
+      <w:proofErr w:type="spellStart"/>
       <w:r>
         <w:rPr>
           <w:b/>
           <w:bCs/>
         </w:rPr>
-        <w:t>Ejari Processing Charges</w:t>
+        <w:t>Ejari</w:t>
+      </w:r>
+      <w:proofErr w:type="spellEnd"/>
+      <w:r>
+        <w:rPr>
+          <w:b/>
+          <w:bCs/>
+        </w:rPr>
+        <w:t xml:space="preserve"> Processing Charges</w:t>
       </w:r>
       <w:r>
         <w:rPr>
@@ -518,9 +543,11 @@
           <w:text/>
         </w:sdtPr>
         <w:sdtContent>
+          <w:proofErr w:type="spellStart"/>
           <w:r>
             <w:t>Ejari_Processing_Charges</w:t>
           </w:r>
+          <w:proofErr w:type="spellEnd"/>
         </w:sdtContent>
       </w:sdt>
       <w:r>
@@ -561,12 +588,14 @@
           <w:text/>
         </w:sdtPr>
         <w:sdtContent>
+          <w:proofErr w:type="spellStart"/>
           <w:r>
             <w:rPr>
               <w:lang w:val="en-IN"/>
             </w:rPr>
             <w:t>Renewal_Charges</w:t>
           </w:r>
+          <w:proofErr w:type="spellEnd"/>
         </w:sdtContent>
       </w:sdt>
       <w:r>
@@ -719,6 +748,7 @@
           <w:text/>
         </w:sdtPr>
         <w:sdtContent>
+          <w:proofErr w:type="spellStart"/>
           <w:r>
             <w:rPr>
               <w:b/>
@@ -726,6 +756,7 @@
             </w:rPr>
             <w:t>CompanyName</w:t>
           </w:r>
+          <w:proofErr w:type="spellEnd"/>
         </w:sdtContent>
       </w:sdt>
       <w:r>
@@ -744,7 +775,12 @@
       </w:r>
     </w:p>
     <w:sectPr>
-      <w:headerReference w:type="default" r:id="rId8"/>
+      <w:headerReference w:type="even" r:id="rId8"/>
+      <w:headerReference w:type="default" r:id="rId9"/>
+      <w:footerReference w:type="even" r:id="rId10"/>
+      <w:footerReference w:type="default" r:id="rId11"/>
+      <w:headerReference w:type="first" r:id="rId12"/>
+      <w:footerReference w:type="first" r:id="rId13"/>
       <w:pgSz w:w="11906" w:h="16838"/>
       <w:pgMar w:top="1701" w:right="1134" w:bottom="1701" w:left="1134" w:header="708" w:footer="708" w:gutter="0"/>
       <w:cols w:space="708"/>
@@ -779,6 +815,36 @@
 </w:endnotes>
 </file>
 
+<file path=word/footer1.xml><?xml version="1.0" encoding="utf-8"?>
+<w:ftr xmlns:wpc="http://schemas.microsoft.com/office/word/2010/wordprocessingCanvas" xmlns:cx="http://schemas.microsoft.com/office/drawing/2014/chartex" xmlns:cx1="http://schemas.microsoft.com/office/drawing/2015/9/8/chartex" xmlns:cx2="http://schemas.microsoft.com/office/drawing/2015/10/21/chartex" xmlns:cx3="http://schemas.microsoft.com/office/drawing/2016/5/9/chartex" xmlns:cx4="http://schemas.microsoft.com/office/drawing/2016/5/10/chartex" xmlns:cx5="http://schemas.microsoft.com/office/drawing/2016/5/11/chartex" xmlns:cx6="http://schemas.microsoft.com/office/drawing/2016/5/12/chartex" xmlns:cx7="http://schemas.microsoft.com/office/drawing/2016/5/13/chartex" xmlns:cx8="http://schemas.microsoft.com/office/drawing/2016/5/14/chartex" xmlns:mc="http://schemas.openxmlformats.org/markup-compatibility/2006" xmlns:aink="http://schemas.microsoft.com/office/drawing/2016/ink" xmlns:am3d="http://schemas.microsoft.com/office/drawing/2017/model3d" xmlns:o="urn:schemas-microsoft-com:office:office" xmlns:oel="http://schemas.microsoft.com/office/2019/extlst" xmlns:r="http://schemas.openxmlformats.org/officeDocument/2006/relationships" xmlns:m="http://schemas.openxmlformats.org/officeDocument/2006/math" xmlns:v="urn:schemas-microsoft-com:vml" xmlns:wp14="http://schemas.microsoft.com/office/word/2010/wordprocessingDrawing" xmlns:wp="http://schemas.openxmlformats.org/drawingml/2006/wordprocessingDrawing" xmlns:w10="urn:schemas-microsoft-com:office:word" xmlns:w="http://schemas.openxmlformats.org/wordprocessingml/2006/main" xmlns:w14="http://schemas.microsoft.com/office/word/2010/wordml" xmlns:w15="http://schemas.microsoft.com/office/word/2012/wordml" xmlns:w16cex="http://schemas.microsoft.com/office/word/2018/wordml/cex" xmlns:w16cid="http://schemas.microsoft.com/office/word/2016/wordml/cid" xmlns:w16="http://schemas.microsoft.com/office/word/2018/wordml" xmlns:w16du="http://schemas.microsoft.com/office/word/2023/wordml/word16du" xmlns:w16sdtdh="http://schemas.microsoft.com/office/word/2020/wordml/sdtdatahash" xmlns:w16se="http://schemas.microsoft.com/office/word/2015/wordml/symex" xmlns:wpg="http://schemas.microsoft.com/office/word/2010/wordprocessingGroup" xmlns:wpi="http://schemas.microsoft.com/office/word/2010/wordprocessingInk" xmlns:wne="http://schemas.microsoft.com/office/word/2006/wordml" xmlns:wps="http://schemas.microsoft.com/office/word/2010/wordprocessingShape" mc:Ignorable="w14 w15 w16se w16cid w16 w16cex w16sdtdh w16du wp14">
+  <w:p>
+    <w:pPr>
+      <w:pStyle w:val="Footer"/>
+    </w:pPr>
+  </w:p>
+</w:ftr>
+</file>
+
+<file path=word/footer2.xml><?xml version="1.0" encoding="utf-8"?>
+<w:ftr xmlns:wpc="http://schemas.microsoft.com/office/word/2010/wordprocessingCanvas" xmlns:cx="http://schemas.microsoft.com/office/drawing/2014/chartex" xmlns:cx1="http://schemas.microsoft.com/office/drawing/2015/9/8/chartex" xmlns:cx2="http://schemas.microsoft.com/office/drawing/2015/10/21/chartex" xmlns:cx3="http://schemas.microsoft.com/office/drawing/2016/5/9/chartex" xmlns:cx4="http://schemas.microsoft.com/office/drawing/2016/5/10/chartex" xmlns:cx5="http://schemas.microsoft.com/office/drawing/2016/5/11/chartex" xmlns:cx6="http://schemas.microsoft.com/office/drawing/2016/5/12/chartex" xmlns:cx7="http://schemas.microsoft.com/office/drawing/2016/5/13/chartex" xmlns:cx8="http://schemas.microsoft.com/office/drawing/2016/5/14/chartex" xmlns:mc="http://schemas.openxmlformats.org/markup-compatibility/2006" xmlns:aink="http://schemas.microsoft.com/office/drawing/2016/ink" xmlns:am3d="http://schemas.microsoft.com/office/drawing/2017/model3d" xmlns:o="urn:schemas-microsoft-com:office:office" xmlns:oel="http://schemas.microsoft.com/office/2019/extlst" xmlns:r="http://schemas.openxmlformats.org/officeDocument/2006/relationships" xmlns:m="http://schemas.openxmlformats.org/officeDocument/2006/math" xmlns:v="urn:schemas-microsoft-com:vml" xmlns:wp14="http://schemas.microsoft.com/office/word/2010/wordprocessingDrawing" xmlns:wp="http://schemas.openxmlformats.org/drawingml/2006/wordprocessingDrawing" xmlns:w10="urn:schemas-microsoft-com:office:word" xmlns:w="http://schemas.openxmlformats.org/wordprocessingml/2006/main" xmlns:w14="http://schemas.microsoft.com/office/word/2010/wordml" xmlns:w15="http://schemas.microsoft.com/office/word/2012/wordml" xmlns:w16cex="http://schemas.microsoft.com/office/word/2018/wordml/cex" xmlns:w16cid="http://schemas.microsoft.com/office/word/2016/wordml/cid" xmlns:w16="http://schemas.microsoft.com/office/word/2018/wordml" xmlns:w16du="http://schemas.microsoft.com/office/word/2023/wordml/word16du" xmlns:w16sdtdh="http://schemas.microsoft.com/office/word/2020/wordml/sdtdatahash" xmlns:w16se="http://schemas.microsoft.com/office/word/2015/wordml/symex" xmlns:wpg="http://schemas.microsoft.com/office/word/2010/wordprocessingGroup" xmlns:wpi="http://schemas.microsoft.com/office/word/2010/wordprocessingInk" xmlns:wne="http://schemas.microsoft.com/office/word/2006/wordml" xmlns:wps="http://schemas.microsoft.com/office/word/2010/wordprocessingShape" mc:Ignorable="w14 w15 w16se w16cid w16 w16cex w16sdtdh w16du wp14">
+  <w:p>
+    <w:pPr>
+      <w:pStyle w:val="Footer"/>
+    </w:pPr>
+  </w:p>
+</w:ftr>
+</file>
+
+<file path=word/footer3.xml><?xml version="1.0" encoding="utf-8"?>
+<w:ftr xmlns:wpc="http://schemas.microsoft.com/office/word/2010/wordprocessingCanvas" xmlns:cx="http://schemas.microsoft.com/office/drawing/2014/chartex" xmlns:cx1="http://schemas.microsoft.com/office/drawing/2015/9/8/chartex" xmlns:cx2="http://schemas.microsoft.com/office/drawing/2015/10/21/chartex" xmlns:cx3="http://schemas.microsoft.com/office/drawing/2016/5/9/chartex" xmlns:cx4="http://schemas.microsoft.com/office/drawing/2016/5/10/chartex" xmlns:cx5="http://schemas.microsoft.com/office/drawing/2016/5/11/chartex" xmlns:cx6="http://schemas.microsoft.com/office/drawing/2016/5/12/chartex" xmlns:cx7="http://schemas.microsoft.com/office/drawing/2016/5/13/chartex" xmlns:cx8="http://schemas.microsoft.com/office/drawing/2016/5/14/chartex" xmlns:mc="http://schemas.openxmlformats.org/markup-compatibility/2006" xmlns:aink="http://schemas.microsoft.com/office/drawing/2016/ink" xmlns:am3d="http://schemas.microsoft.com/office/drawing/2017/model3d" xmlns:o="urn:schemas-microsoft-com:office:office" xmlns:oel="http://schemas.microsoft.com/office/2019/extlst" xmlns:r="http://schemas.openxmlformats.org/officeDocument/2006/relationships" xmlns:m="http://schemas.openxmlformats.org/officeDocument/2006/math" xmlns:v="urn:schemas-microsoft-com:vml" xmlns:wp14="http://schemas.microsoft.com/office/word/2010/wordprocessingDrawing" xmlns:wp="http://schemas.openxmlformats.org/drawingml/2006/wordprocessingDrawing" xmlns:w10="urn:schemas-microsoft-com:office:word" xmlns:w="http://schemas.openxmlformats.org/wordprocessingml/2006/main" xmlns:w14="http://schemas.microsoft.com/office/word/2010/wordml" xmlns:w15="http://schemas.microsoft.com/office/word/2012/wordml" xmlns:w16cex="http://schemas.microsoft.com/office/word/2018/wordml/cex" xmlns:w16cid="http://schemas.microsoft.com/office/word/2016/wordml/cid" xmlns:w16="http://schemas.microsoft.com/office/word/2018/wordml" xmlns:w16du="http://schemas.microsoft.com/office/word/2023/wordml/word16du" xmlns:w16sdtdh="http://schemas.microsoft.com/office/word/2020/wordml/sdtdatahash" xmlns:w16se="http://schemas.microsoft.com/office/word/2015/wordml/symex" xmlns:wpg="http://schemas.microsoft.com/office/word/2010/wordprocessingGroup" xmlns:wpi="http://schemas.microsoft.com/office/word/2010/wordprocessingInk" xmlns:wne="http://schemas.microsoft.com/office/word/2006/wordml" xmlns:wps="http://schemas.microsoft.com/office/word/2010/wordprocessingShape" mc:Ignorable="w14 w15 w16se w16cid w16 w16cex w16sdtdh w16du wp14">
+  <w:p>
+    <w:pPr>
+      <w:pStyle w:val="Footer"/>
+    </w:pPr>
+  </w:p>
+</w:ftr>
+</file>
+
 <file path=word/footnotes.xml><?xml version="1.0" encoding="utf-8"?>
 <w:footnotes xmlns:wpc="http://schemas.microsoft.com/office/word/2010/wordprocessingCanvas" xmlns:cx="http://schemas.microsoft.com/office/drawing/2014/chartex" xmlns:cx1="http://schemas.microsoft.com/office/drawing/2015/9/8/chartex" xmlns:cx2="http://schemas.microsoft.com/office/drawing/2015/10/21/chartex" xmlns:cx3="http://schemas.microsoft.com/office/drawing/2016/5/9/chartex" xmlns:cx4="http://schemas.microsoft.com/office/drawing/2016/5/10/chartex" xmlns:cx5="http://schemas.microsoft.com/office/drawing/2016/5/11/chartex" xmlns:cx6="http://schemas.microsoft.com/office/drawing/2016/5/12/chartex" xmlns:cx7="http://schemas.microsoft.com/office/drawing/2016/5/13/chartex" xmlns:cx8="http://schemas.microsoft.com/office/drawing/2016/5/14/chartex" xmlns:mc="http://schemas.openxmlformats.org/markup-compatibility/2006" xmlns:aink="http://schemas.microsoft.com/office/drawing/2016/ink" xmlns:am3d="http://schemas.microsoft.com/office/drawing/2017/model3d" xmlns:o="urn:schemas-microsoft-com:office:office" xmlns:oel="http://schemas.microsoft.com/office/2019/extlst" xmlns:r="http://schemas.openxmlformats.org/officeDocument/2006/relationships" xmlns:m="http://schemas.openxmlformats.org/officeDocument/2006/math" xmlns:v="urn:schemas-microsoft-com:vml" xmlns:wp14="http://schemas.microsoft.com/office/word/2010/wordprocessingDrawing" xmlns:wp="http://schemas.openxmlformats.org/drawingml/2006/wordprocessingDrawing" xmlns:w10="urn:schemas-microsoft-com:office:word" xmlns:w="http://schemas.openxmlformats.org/wordprocessingml/2006/main" xmlns:w14="http://schemas.microsoft.com/office/word/2010/wordml" xmlns:w15="http://schemas.microsoft.com/office/word/2012/wordml" xmlns:w16cex="http://schemas.microsoft.com/office/word/2018/wordml/cex" xmlns:w16cid="http://schemas.microsoft.com/office/word/2016/wordml/cid" xmlns:w16="http://schemas.microsoft.com/office/word/2018/wordml" xmlns:w16du="http://schemas.microsoft.com/office/word/2023/wordml/word16du" xmlns:w16sdtdh="http://schemas.microsoft.com/office/word/2020/wordml/sdtdatahash" xmlns:w16se="http://schemas.microsoft.com/office/word/2015/wordml/symex" xmlns:wpg="http://schemas.microsoft.com/office/word/2010/wordprocessingGroup" xmlns:wpi="http://schemas.microsoft.com/office/word/2010/wordprocessingInk" xmlns:wne="http://schemas.microsoft.com/office/word/2006/wordml" xmlns:wps="http://schemas.microsoft.com/office/word/2010/wordprocessingShape" mc:Ignorable="w14 w15 w16se w16cid w16 w16cex w16sdtdh w16du wp14">
   <w:footnote w:type="separator" w:id="-1">
@@ -805,6 +871,16 @@
 </file>
 
 <file path=word/header1.xml><?xml version="1.0" encoding="utf-8"?>
+<w:hdr xmlns:wpc="http://schemas.microsoft.com/office/word/2010/wordprocessingCanvas" xmlns:cx="http://schemas.microsoft.com/office/drawing/2014/chartex" xmlns:cx1="http://schemas.microsoft.com/office/drawing/2015/9/8/chartex" xmlns:cx2="http://schemas.microsoft.com/office/drawing/2015/10/21/chartex" xmlns:cx3="http://schemas.microsoft.com/office/drawing/2016/5/9/chartex" xmlns:cx4="http://schemas.microsoft.com/office/drawing/2016/5/10/chartex" xmlns:cx5="http://schemas.microsoft.com/office/drawing/2016/5/11/chartex" xmlns:cx6="http://schemas.microsoft.com/office/drawing/2016/5/12/chartex" xmlns:cx7="http://schemas.microsoft.com/office/drawing/2016/5/13/chartex" xmlns:cx8="http://schemas.microsoft.com/office/drawing/2016/5/14/chartex" xmlns:mc="http://schemas.openxmlformats.org/markup-compatibility/2006" xmlns:aink="http://schemas.microsoft.com/office/drawing/2016/ink" xmlns:am3d="http://schemas.microsoft.com/office/drawing/2017/model3d" xmlns:o="urn:schemas-microsoft-com:office:office" xmlns:oel="http://schemas.microsoft.com/office/2019/extlst" xmlns:r="http://schemas.openxmlformats.org/officeDocument/2006/relationships" xmlns:m="http://schemas.openxmlformats.org/officeDocument/2006/math" xmlns:v="urn:schemas-microsoft-com:vml" xmlns:wp14="http://schemas.microsoft.com/office/word/2010/wordprocessingDrawing" xmlns:wp="http://schemas.openxmlformats.org/drawingml/2006/wordprocessingDrawing" xmlns:w10="urn:schemas-microsoft-com:office:word" xmlns:w="http://schemas.openxmlformats.org/wordprocessingml/2006/main" xmlns:w14="http://schemas.microsoft.com/office/word/2010/wordml" xmlns:w15="http://schemas.microsoft.com/office/word/2012/wordml" xmlns:w16cex="http://schemas.microsoft.com/office/word/2018/wordml/cex" xmlns:w16cid="http://schemas.microsoft.com/office/word/2016/wordml/cid" xmlns:w16="http://schemas.microsoft.com/office/word/2018/wordml" xmlns:w16du="http://schemas.microsoft.com/office/word/2023/wordml/word16du" xmlns:w16sdtdh="http://schemas.microsoft.com/office/word/2020/wordml/sdtdatahash" xmlns:w16se="http://schemas.microsoft.com/office/word/2015/wordml/symex" xmlns:wpg="http://schemas.microsoft.com/office/word/2010/wordprocessingGroup" xmlns:wpi="http://schemas.microsoft.com/office/word/2010/wordprocessingInk" xmlns:wne="http://schemas.microsoft.com/office/word/2006/wordml" xmlns:wps="http://schemas.microsoft.com/office/word/2010/wordprocessingShape" mc:Ignorable="w14 w15 w16se w16cid w16 w16cex w16sdtdh w16du wp14">
+  <w:p>
+    <w:pPr>
+      <w:pStyle w:val="Header"/>
+    </w:pPr>
+  </w:p>
+</w:hdr>
+</file>
+
+<file path=word/header2.xml><?xml version="1.0" encoding="utf-8"?>
 <w:hdr xmlns:wpc="http://schemas.microsoft.com/office/word/2010/wordprocessingCanvas" xmlns:cx="http://schemas.microsoft.com/office/drawing/2014/chartex" xmlns:cx1="http://schemas.microsoft.com/office/drawing/2015/9/8/chartex" xmlns:cx2="http://schemas.microsoft.com/office/drawing/2015/10/21/chartex" xmlns:cx3="http://schemas.microsoft.com/office/drawing/2016/5/9/chartex" xmlns:cx4="http://schemas.microsoft.com/office/drawing/2016/5/10/chartex" xmlns:cx5="http://schemas.microsoft.com/office/drawing/2016/5/11/chartex" xmlns:cx6="http://schemas.microsoft.com/office/drawing/2016/5/12/chartex" xmlns:cx7="http://schemas.microsoft.com/office/drawing/2016/5/13/chartex" xmlns:cx8="http://schemas.microsoft.com/office/drawing/2016/5/14/chartex" xmlns:mc="http://schemas.openxmlformats.org/markup-compatibility/2006" xmlns:aink="http://schemas.microsoft.com/office/drawing/2016/ink" xmlns:am3d="http://schemas.microsoft.com/office/drawing/2017/model3d" xmlns:o="urn:schemas-microsoft-com:office:office" xmlns:oel="http://schemas.microsoft.com/office/2019/extlst" xmlns:r="http://schemas.openxmlformats.org/officeDocument/2006/relationships" xmlns:m="http://schemas.openxmlformats.org/officeDocument/2006/math" xmlns:v="urn:schemas-microsoft-com:vml" xmlns:wp14="http://schemas.microsoft.com/office/word/2010/wordprocessingDrawing" xmlns:wp="http://schemas.openxmlformats.org/drawingml/2006/wordprocessingDrawing" xmlns:w10="urn:schemas-microsoft-com:office:word" xmlns:w="http://schemas.openxmlformats.org/wordprocessingml/2006/main" xmlns:w14="http://schemas.microsoft.com/office/word/2010/wordml" xmlns:w15="http://schemas.microsoft.com/office/word/2012/wordml" xmlns:w16cex="http://schemas.microsoft.com/office/word/2018/wordml/cex" xmlns:w16cid="http://schemas.microsoft.com/office/word/2016/wordml/cid" xmlns:w16="http://schemas.microsoft.com/office/word/2018/wordml" xmlns:w16du="http://schemas.microsoft.com/office/word/2023/wordml/word16du" xmlns:w16sdtdh="http://schemas.microsoft.com/office/word/2020/wordml/sdtdatahash" xmlns:w16se="http://schemas.microsoft.com/office/word/2015/wordml/symex" xmlns:wpg="http://schemas.microsoft.com/office/word/2010/wordprocessingGroup" xmlns:wpi="http://schemas.microsoft.com/office/word/2010/wordprocessingInk" xmlns:wne="http://schemas.microsoft.com/office/word/2006/wordml" xmlns:wps="http://schemas.microsoft.com/office/word/2010/wordprocessingShape" mc:Ignorable="w14 w15 w16se w16cid w16 w16cex w16sdtdh w16du wp14">
   <w:p>
     <w:pPr>
@@ -830,9 +906,9 @@
             <w:noProof/>
           </w:rPr>
           <w:drawing>
-            <wp:inline distT="0" distB="0" distL="0" distR="0" wp14:anchorId="23357863" wp14:editId="39A5615B">
-              <wp:extent cx="2378133" cy="1318260"/>
-              <wp:effectExtent l="0" t="0" r="3175" b="0"/>
+            <wp:inline distT="0" distB="0" distL="0" distR="0" wp14:anchorId="23357863" wp14:editId="3D91EF59">
+              <wp:extent cx="1905000" cy="1323340"/>
+              <wp:effectExtent l="0" t="0" r="0" b="0"/>
               <wp:docPr id="1" name="Picture 1"/>
               <wp:cNvGraphicFramePr>
                 <a:graphicFrameLocks xmlns:a="http://schemas.openxmlformats.org/drawingml/2006/main" noChangeAspect="1"/>
@@ -855,7 +931,7 @@
                     <pic:spPr bwMode="auto">
                       <a:xfrm>
                         <a:off x="0" y="0"/>
-                        <a:ext cx="2387755" cy="1323594"/>
+                        <a:ext cx="1905366" cy="1323594"/>
                       </a:xfrm>
                       <a:prstGeom prst="rect">
                         <a:avLst/>
@@ -873,6 +949,16 @@
         </w:r>
       </w:sdtContent>
     </w:sdt>
+  </w:p>
+</w:hdr>
+</file>
+
+<file path=word/header3.xml><?xml version="1.0" encoding="utf-8"?>
+<w:hdr xmlns:wpc="http://schemas.microsoft.com/office/word/2010/wordprocessingCanvas" xmlns:cx="http://schemas.microsoft.com/office/drawing/2014/chartex" xmlns:cx1="http://schemas.microsoft.com/office/drawing/2015/9/8/chartex" xmlns:cx2="http://schemas.microsoft.com/office/drawing/2015/10/21/chartex" xmlns:cx3="http://schemas.microsoft.com/office/drawing/2016/5/9/chartex" xmlns:cx4="http://schemas.microsoft.com/office/drawing/2016/5/10/chartex" xmlns:cx5="http://schemas.microsoft.com/office/drawing/2016/5/11/chartex" xmlns:cx6="http://schemas.microsoft.com/office/drawing/2016/5/12/chartex" xmlns:cx7="http://schemas.microsoft.com/office/drawing/2016/5/13/chartex" xmlns:cx8="http://schemas.microsoft.com/office/drawing/2016/5/14/chartex" xmlns:mc="http://schemas.openxmlformats.org/markup-compatibility/2006" xmlns:aink="http://schemas.microsoft.com/office/drawing/2016/ink" xmlns:am3d="http://schemas.microsoft.com/office/drawing/2017/model3d" xmlns:o="urn:schemas-microsoft-com:office:office" xmlns:oel="http://schemas.microsoft.com/office/2019/extlst" xmlns:r="http://schemas.openxmlformats.org/officeDocument/2006/relationships" xmlns:m="http://schemas.openxmlformats.org/officeDocument/2006/math" xmlns:v="urn:schemas-microsoft-com:vml" xmlns:wp14="http://schemas.microsoft.com/office/word/2010/wordprocessingDrawing" xmlns:wp="http://schemas.openxmlformats.org/drawingml/2006/wordprocessingDrawing" xmlns:w10="urn:schemas-microsoft-com:office:word" xmlns:w="http://schemas.openxmlformats.org/wordprocessingml/2006/main" xmlns:w14="http://schemas.microsoft.com/office/word/2010/wordml" xmlns:w15="http://schemas.microsoft.com/office/word/2012/wordml" xmlns:w16cex="http://schemas.microsoft.com/office/word/2018/wordml/cex" xmlns:w16cid="http://schemas.microsoft.com/office/word/2016/wordml/cid" xmlns:w16="http://schemas.microsoft.com/office/word/2018/wordml" xmlns:w16du="http://schemas.microsoft.com/office/word/2023/wordml/word16du" xmlns:w16sdtdh="http://schemas.microsoft.com/office/word/2020/wordml/sdtdatahash" xmlns:w16se="http://schemas.microsoft.com/office/word/2015/wordml/symex" xmlns:wpg="http://schemas.microsoft.com/office/word/2010/wordprocessingGroup" xmlns:wpi="http://schemas.microsoft.com/office/word/2010/wordprocessingInk" xmlns:wne="http://schemas.microsoft.com/office/word/2006/wordml" xmlns:wps="http://schemas.microsoft.com/office/word/2010/wordprocessingShape" mc:Ignorable="w14 w15 w16se w16cid w16 w16cex w16sdtdh w16du wp14">
+  <w:p>
+    <w:pPr>
+      <w:pStyle w:val="Header"/>
+    </w:pPr>
   </w:p>
 </w:hdr>
 </file>
@@ -2151,7 +2237,9 @@
     <w:rsid w:val="009365E7"/>
     <w:rsid w:val="00983159"/>
     <w:rsid w:val="009E34F8"/>
+    <w:rsid w:val="009E4721"/>
     <w:rsid w:val="00B27871"/>
+    <w:rsid w:val="00B60702"/>
     <w:rsid w:val="00CA6DD2"/>
     <w:rsid w:val="00CD0811"/>
     <w:rsid w:val="00CE6713"/>
@@ -2929,6 +3017,8 @@
  
      < C o n t r a c t R e n e w a l >   
+         < A n n u a l _ R e n t _ A m o u n t > A n n u a l _ R e n t _ A m o u n t < / A n n u a l _ R e n t _ A m o u n t > + 
          < C o m m u n i t y > C o m m u n i t y < / C o m m u n i t y >   
          < C o m p a n y N a m e > C o m p a n y N a m e < / C o m p a n y N a m e > @@ -2947,8 +3037,6 @@
  
          < R e n e w a l _ C h a r g e s > R e n e w a l _ C h a r g e s < / R e n e w a l _ C h a r g e s >   
-         < R e n t _ A m o u n t > R e n t _ A m o u n t < / R e n t _ A m o u n t > - 
          < R e r a > R e r a < / R e r a >   
          < T e n a n t _ F u l l _ N a m e > T e n a n t _ F u l l _ N a m e < / T e n a n t _ F u l l _ N a m e > @@ -2956,6 +3044,14 @@
          < U n i t _ N u m b e r > U n i t _ N u m b e r < / U n i t _ N u m b e r >   
      < / C o n t r a c t R e n e w a l > + 
+     < C o n t r a c t _ R e n e w a l _ S u b p a g e > + 
+         < R E R A _ F e e s > R E R A _ F e e s < / R E R A _ F e e s > + 
+         < S e c o n d a r y _ I t e m _ T y p e > S e c o n d a r y _ I t e m _ T y p e < / S e c o n d a r y _ I t e m _ T y p e > + 
+     < / C o n t r a c t _ R e n e w a l _ S u b p a g e >   
  < / N a v W o r d R e p o r t X m l P a r t > 
 </file>

</xml_diff>

<commit_message>
add contract renewal field in contract renewal report
</commit_message>
<xml_diff>
--- a/ContractRenewal.docx
+++ b/ContractRenewal.docx
@@ -432,11 +432,11 @@
           <w:rPr>
             <w:lang w:val="en-IN"/>
           </w:rPr>
-          <w:id w:val="640704773"/>
+          <w:id w:val="533000035"/>
           <w:placeholder>
             <w:docPart w:val="DefaultPlaceholder_-1854013440"/>
           </w:placeholder>
-          <w:dataBinding w:prefixMappings="xmlns:ns0='urn:microsoft-dynamics-nav/reports/Contract_Renewal/50108/' " w:xpath="/ns0:NavWordReportXmlPart[1]/ns0:ContractRenewal[1]/ns0:Annual_Rent_Amount[1]" w:storeItemID="{BD9CF13E-9824-44A6-B64B-7DDEA188B36D}"/>
+          <w:dataBinding w:prefixMappings="xmlns:ns0='urn:microsoft-dynamics-nav/reports/Contract_Renewal/50108/' " w:xpath="/ns0:NavWordReportXmlPart[1]/ns0:ContractRenewal[1]/ns0:Contract_Amount[1]" w:storeItemID="{BD9CF13E-9824-44A6-B64B-7DDEA188B36D}"/>
           <w:text/>
         </w:sdtPr>
         <w:sdtContent>
@@ -445,7 +445,7 @@
             <w:rPr>
               <w:lang w:val="en-IN"/>
             </w:rPr>
-            <w:t>Annual_Rent_Amount</w:t>
+            <w:t>Contract_Amount</w:t>
           </w:r>
           <w:proofErr w:type="spellEnd"/>
         </w:sdtContent>
@@ -906,9 +906,9 @@
             <w:noProof/>
           </w:rPr>
           <w:drawing>
-            <wp:inline distT="0" distB="0" distL="0" distR="0" wp14:anchorId="23357863" wp14:editId="3D91EF59">
-              <wp:extent cx="1905000" cy="1323340"/>
-              <wp:effectExtent l="0" t="0" r="0" b="0"/>
+            <wp:inline distT="0" distB="0" distL="0" distR="0" wp14:anchorId="23357863" wp14:editId="2644C9FC">
+              <wp:extent cx="2072640" cy="1323340"/>
+              <wp:effectExtent l="0" t="0" r="3810" b="0"/>
               <wp:docPr id="1" name="Picture 1"/>
               <wp:cNvGraphicFramePr>
                 <a:graphicFrameLocks xmlns:a="http://schemas.openxmlformats.org/drawingml/2006/main" noChangeAspect="1"/>
@@ -931,7 +931,7 @@
                     <pic:spPr bwMode="auto">
                       <a:xfrm>
                         <a:off x="0" y="0"/>
-                        <a:ext cx="1905366" cy="1323594"/>
+                        <a:ext cx="2073039" cy="1323595"/>
                       </a:xfrm>
                       <a:prstGeom prst="rect">
                         <a:avLst/>
@@ -2233,6 +2233,7 @@
     <w:rsid w:val="006F67DB"/>
     <w:rsid w:val="007A34EA"/>
     <w:rsid w:val="007F5F08"/>
+    <w:rsid w:val="008D038C"/>
     <w:rsid w:val="008E4707"/>
     <w:rsid w:val="009365E7"/>
     <w:rsid w:val="00983159"/>
@@ -2240,6 +2241,7 @@
     <w:rsid w:val="009E4721"/>
     <w:rsid w:val="00B27871"/>
     <w:rsid w:val="00B60702"/>
+    <w:rsid w:val="00BF2FFD"/>
     <w:rsid w:val="00CA6DD2"/>
     <w:rsid w:val="00CD0811"/>
     <w:rsid w:val="00CE6713"/>
@@ -3025,6 +3027,8 @@
  
          < C o m p a n y P i c t u r e > C o m p a n y P i c t u r e < / C o m p a n y P i c t u r e >   
+         < C o n t r a c t _ A m o u n t > C o n t r a c t _ A m o u n t < / C o n t r a c t _ A m o u n t > + 
          < C o n t r a c t _ D a t e > C o n t r a c t _ D a t e < / C o n t r a c t _ D a t e >   
          < C o n t r a c t _ E n d _ D a t e > C o n t r a c t _ E n d _ D a t e < / C o n t r a c t _ E n d _ D a t e > @@ -3045,14 +3049,6 @@
  
      < / C o n t r a c t R e n e w a l >   
-     < C o n t r a c t _ R e n e w a l _ S u b p a g e > - 
-         < R E R A _ F e e s > R E R A _ F e e s < / R E R A _ F e e s > - 
-         < S e c o n d a r y _ I t e m _ T y p e > S e c o n d a r y _ I t e m _ T y p e < / S e c o n d a r y _ I t e m _ T y p e > - 
-     < / C o n t r a c t _ R e n e w a l _ S u b p a g e > - 
  < / N a v W o r d R e p o r t X m l P a r t > 
 </file>
 

</xml_diff>

<commit_message>
added some changes in contract master data and revenue allocation grid
</commit_message>
<xml_diff>
--- a/ContractRenewal.docx
+++ b/ContractRenewal.docx
@@ -432,11 +432,13 @@
           <w:rPr>
             <w:lang w:val="en-IN"/>
           </w:rPr>
+          <w:alias w:val="#Nav: /ContractRenewal/Contract_Amount"/>
+          <w:tag w:val="#Nav: Contract_Renewal/50108"/>
           <w:id w:val="533000035"/>
           <w:placeholder>
             <w:docPart w:val="DefaultPlaceholder_-1854013440"/>
           </w:placeholder>
-          <w:dataBinding w:prefixMappings="xmlns:ns0='urn:microsoft-dynamics-nav/reports/Contract_Renewal/50108/' " w:xpath="/ns0:NavWordReportXmlPart[1]/ns0:ContractRenewal[1]/ns0:Contract_Amount[1]" w:storeItemID="{BD9CF13E-9824-44A6-B64B-7DDEA188B36D}"/>
+          <w:dataBinding w:prefixMappings="xmlns:ns0='urn:microsoft-dynamics-nav/reports/Contract_Renewal/50108/'" w:xpath="/ns0:NavWordReportXmlPart[1]/ns0:ContractRenewal[1]/ns0:Contract_Amount[1]" w:storeItemID="{BD9CF13E-9824-44A6-B64B-7DDEA188B36D}"/>
           <w:text/>
         </w:sdtPr>
         <w:sdtContent>
@@ -472,21 +474,27 @@
           <w:bCs/>
           <w:lang w:val="en-IN"/>
         </w:rPr>
-        <w:t xml:space="preserve">                                      :  </w:t>
+        <w:t xml:space="preserve">                                      : </w:t>
+      </w:r>
+      <w:r>
+        <w:rPr>
+          <w:lang w:val="en-IN"/>
+        </w:rPr>
+        <w:t xml:space="preserve"> </w:t>
       </w:r>
       <w:sdt>
         <w:sdtPr>
           <w:rPr>
             <w:lang w:val="en-IN"/>
           </w:rPr>
-          <w:alias w:val="#Nav: /ContractRenewal/Rera"/>
-          <w:tag w:val="#Nav: Contract_Renewal/50108"/>
-          <w:id w:val="1561828856"/>
+          <w:id w:val="-1016544911"/>
           <w:placeholder>
             <w:docPart w:val="DefaultPlaceholder_-1854013440"/>
           </w:placeholder>
           <w:dataBinding w:prefixMappings="xmlns:ns0='urn:microsoft-dynamics-nav/reports/Contract_Renewal/50108/'" w:xpath="/ns0:NavWordReportXmlPart[1]/ns0:ContractRenewal[1]/ns0:Rera[1]" w:storeItemID="{BD9CF13E-9824-44A6-B64B-7DDEA188B36D}"/>
           <w:text/>
+          <w:alias w:val="#Nav: /ContractRenewal/Rera"/>
+          <w:tag w:val="#Nav: Contract_Renewal/50108"/>
         </w:sdtPr>
         <w:sdtContent>
           <w:r>
@@ -529,18 +537,21 @@
         <w:t xml:space="preserve">   </w:t>
       </w:r>
       <w:r>
-        <w:t xml:space="preserve">:  </w:t>
+        <w:t xml:space="preserve">: </w:t>
+      </w:r>
+      <w:r>
+        <w:t xml:space="preserve"> </w:t>
       </w:r>
       <w:sdt>
         <w:sdtPr>
-          <w:alias w:val="#Nav: /ContractRenewal/Ejari_Processing_Charges"/>
-          <w:tag w:val="#Nav: Contract_Renewal/50108"/>
-          <w:id w:val="-1417080719"/>
+          <w:id w:val="-812721654"/>
           <w:placeholder>
             <w:docPart w:val="DefaultPlaceholder_-1854013440"/>
           </w:placeholder>
           <w:dataBinding w:prefixMappings="xmlns:ns0='urn:microsoft-dynamics-nav/reports/Contract_Renewal/50108/'" w:xpath="/ns0:NavWordReportXmlPart[1]/ns0:ContractRenewal[1]/ns0:Ejari_Processing_Charges[1]" w:storeItemID="{BD9CF13E-9824-44A6-B64B-7DDEA188B36D}"/>
           <w:text/>
+          <w:alias w:val="#Nav: /ContractRenewal/Ejari_Processing_Charges"/>
+          <w:tag w:val="#Nav: Contract_Renewal/50108"/>
         </w:sdtPr>
         <w:sdtContent>
           <w:proofErr w:type="spellStart"/>
@@ -578,14 +589,14 @@
           <w:rPr>
             <w:lang w:val="en-IN"/>
           </w:rPr>
-          <w:alias w:val="#Nav: /ContractRenewal/Renewal_Charges"/>
-          <w:tag w:val="#Nav: Contract_Renewal/50108"/>
-          <w:id w:val="1726881206"/>
+          <w:id w:val="-385880689"/>
           <w:placeholder>
             <w:docPart w:val="DefaultPlaceholder_-1854013440"/>
           </w:placeholder>
           <w:dataBinding w:prefixMappings="xmlns:ns0='urn:microsoft-dynamics-nav/reports/Contract_Renewal/50108/'" w:xpath="/ns0:NavWordReportXmlPart[1]/ns0:ContractRenewal[1]/ns0:Renewal_Charges[1]" w:storeItemID="{BD9CF13E-9824-44A6-B64B-7DDEA188B36D}"/>
           <w:text/>
+          <w:alias w:val="#Nav: /ContractRenewal/Renewal_Charges"/>
+          <w:tag w:val="#Nav: Contract_Renewal/50108"/>
         </w:sdtPr>
         <w:sdtContent>
           <w:proofErr w:type="spellStart"/>
@@ -881,7 +892,7 @@
 </file>
 
 <file path=word/header2.xml><?xml version="1.0" encoding="utf-8"?>
-<w:hdr xmlns:wpc="http://schemas.microsoft.com/office/word/2010/wordprocessingCanvas" xmlns:cx="http://schemas.microsoft.com/office/drawing/2014/chartex" xmlns:cx1="http://schemas.microsoft.com/office/drawing/2015/9/8/chartex" xmlns:cx2="http://schemas.microsoft.com/office/drawing/2015/10/21/chartex" xmlns:cx3="http://schemas.microsoft.com/office/drawing/2016/5/9/chartex" xmlns:cx4="http://schemas.microsoft.com/office/drawing/2016/5/10/chartex" xmlns:cx5="http://schemas.microsoft.com/office/drawing/2016/5/11/chartex" xmlns:cx6="http://schemas.microsoft.com/office/drawing/2016/5/12/chartex" xmlns:cx7="http://schemas.microsoft.com/office/drawing/2016/5/13/chartex" xmlns:cx8="http://schemas.microsoft.com/office/drawing/2016/5/14/chartex" xmlns:mc="http://schemas.openxmlformats.org/markup-compatibility/2006" xmlns:aink="http://schemas.microsoft.com/office/drawing/2016/ink" xmlns:am3d="http://schemas.microsoft.com/office/drawing/2017/model3d" xmlns:o="urn:schemas-microsoft-com:office:office" xmlns:oel="http://schemas.microsoft.com/office/2019/extlst" xmlns:r="http://schemas.openxmlformats.org/officeDocument/2006/relationships" xmlns:m="http://schemas.openxmlformats.org/officeDocument/2006/math" xmlns:v="urn:schemas-microsoft-com:vml" xmlns:wp14="http://schemas.microsoft.com/office/word/2010/wordprocessingDrawing" xmlns:wp="http://schemas.openxmlformats.org/drawingml/2006/wordprocessingDrawing" xmlns:w10="urn:schemas-microsoft-com:office:word" xmlns:w="http://schemas.openxmlformats.org/wordprocessingml/2006/main" xmlns:w14="http://schemas.microsoft.com/office/word/2010/wordml" xmlns:w15="http://schemas.microsoft.com/office/word/2012/wordml" xmlns:w16cex="http://schemas.microsoft.com/office/word/2018/wordml/cex" xmlns:w16cid="http://schemas.microsoft.com/office/word/2016/wordml/cid" xmlns:w16="http://schemas.microsoft.com/office/word/2018/wordml" xmlns:w16du="http://schemas.microsoft.com/office/word/2023/wordml/word16du" xmlns:w16sdtdh="http://schemas.microsoft.com/office/word/2020/wordml/sdtdatahash" xmlns:w16se="http://schemas.microsoft.com/office/word/2015/wordml/symex" xmlns:wpg="http://schemas.microsoft.com/office/word/2010/wordprocessingGroup" xmlns:wpi="http://schemas.microsoft.com/office/word/2010/wordprocessingInk" xmlns:wne="http://schemas.microsoft.com/office/word/2006/wordml" xmlns:wps="http://schemas.microsoft.com/office/word/2010/wordprocessingShape" mc:Ignorable="w14 w15 w16se w16cid w16 w16cex w16sdtdh w16du wp14">
+<w:hdr xmlns:a="http://schemas.openxmlformats.org/drawingml/2006/main" xmlns:pic="http://schemas.openxmlformats.org/drawingml/2006/picture" xmlns:wpc="http://schemas.microsoft.com/office/word/2010/wordprocessingCanvas" xmlns:cx="http://schemas.microsoft.com/office/drawing/2014/chartex" xmlns:cx1="http://schemas.microsoft.com/office/drawing/2015/9/8/chartex" xmlns:cx2="http://schemas.microsoft.com/office/drawing/2015/10/21/chartex" xmlns:cx3="http://schemas.microsoft.com/office/drawing/2016/5/9/chartex" xmlns:cx4="http://schemas.microsoft.com/office/drawing/2016/5/10/chartex" xmlns:cx5="http://schemas.microsoft.com/office/drawing/2016/5/11/chartex" xmlns:cx6="http://schemas.microsoft.com/office/drawing/2016/5/12/chartex" xmlns:cx7="http://schemas.microsoft.com/office/drawing/2016/5/13/chartex" xmlns:cx8="http://schemas.microsoft.com/office/drawing/2016/5/14/chartex" xmlns:mc="http://schemas.openxmlformats.org/markup-compatibility/2006" xmlns:aink="http://schemas.microsoft.com/office/drawing/2016/ink" xmlns:am3d="http://schemas.microsoft.com/office/drawing/2017/model3d" xmlns:o="urn:schemas-microsoft-com:office:office" xmlns:oel="http://schemas.microsoft.com/office/2019/extlst" xmlns:r="http://schemas.openxmlformats.org/officeDocument/2006/relationships" xmlns:m="http://schemas.openxmlformats.org/officeDocument/2006/math" xmlns:v="urn:schemas-microsoft-com:vml" xmlns:wp14="http://schemas.microsoft.com/office/word/2010/wordprocessingDrawing" xmlns:wp="http://schemas.openxmlformats.org/drawingml/2006/wordprocessingDrawing" xmlns:w10="urn:schemas-microsoft-com:office:word" xmlns:w="http://schemas.openxmlformats.org/wordprocessingml/2006/main" xmlns:w14="http://schemas.microsoft.com/office/word/2010/wordml" xmlns:w15="http://schemas.microsoft.com/office/word/2012/wordml" xmlns:w16cex="http://schemas.microsoft.com/office/word/2018/wordml/cex" xmlns:w16cid="http://schemas.microsoft.com/office/word/2016/wordml/cid" xmlns:w16="http://schemas.microsoft.com/office/word/2018/wordml" xmlns:w16du="http://schemas.microsoft.com/office/word/2023/wordml/word16du" xmlns:w16sdtdh="http://schemas.microsoft.com/office/word/2020/wordml/sdtdatahash" xmlns:w16se="http://schemas.microsoft.com/office/word/2015/wordml/symex" xmlns:wpg="http://schemas.microsoft.com/office/word/2010/wordprocessingGroup" xmlns:wpi="http://schemas.microsoft.com/office/word/2010/wordprocessingInk" xmlns:wne="http://schemas.microsoft.com/office/word/2006/wordml" xmlns:wps="http://schemas.microsoft.com/office/word/2010/wordprocessingShape" mc:Ignorable="w14 w15 w16se w16cid w16 w16cex w16sdtdh w16du wp14">
   <w:p>
     <w:pPr>
       <w:pStyle w:val="Header"/>
@@ -906,8 +917,8 @@
             <w:noProof/>
           </w:rPr>
           <w:drawing>
-            <wp:inline distT="0" distB="0" distL="0" distR="0" wp14:anchorId="23357863" wp14:editId="2644C9FC">
-              <wp:extent cx="2072640" cy="1323340"/>
+            <wp:inline distT="0" distB="0" distL="0" distR="0" wp14:anchorId="23357863" wp14:editId="447C9C15">
+              <wp:extent cx="1767840" cy="1323340"/>
               <wp:effectExtent l="0" t="0" r="3810" b="0"/>
               <wp:docPr id="1" name="Picture 1"/>
               <wp:cNvGraphicFramePr>
@@ -931,7 +942,7 @@
                     <pic:spPr bwMode="auto">
                       <a:xfrm>
                         <a:off x="0" y="0"/>
-                        <a:ext cx="2073039" cy="1323595"/>
+                        <a:ext cx="1768185" cy="1323598"/>
                       </a:xfrm>
                       <a:prstGeom prst="rect">
                         <a:avLst/>
@@ -2228,6 +2239,7 @@
     <w:rsid w:val="0028153C"/>
     <w:rsid w:val="00300464"/>
     <w:rsid w:val="003104B0"/>
+    <w:rsid w:val="00451E60"/>
     <w:rsid w:val="00463DCE"/>
     <w:rsid w:val="0053064F"/>
     <w:rsid w:val="006F67DB"/>
@@ -2239,6 +2251,7 @@
     <w:rsid w:val="00983159"/>
     <w:rsid w:val="009E34F8"/>
     <w:rsid w:val="009E4721"/>
+    <w:rsid w:val="00A333C1"/>
     <w:rsid w:val="00B27871"/>
     <w:rsid w:val="00B60702"/>
     <w:rsid w:val="00BF2FFD"/>

</xml_diff>